<commit_message>
Order Form: Add provisioning contact
</commit_message>
<xml_diff>
--- a/files/MICE Order Form.docx
+++ b/files/MICE Order Form.docx
@@ -745,6 +745,7 @@
         <w:rPr>
           <w:rFonts w:ascii="Arial" w:hAnsi="Arial" w:cs="Arial"/>
         </w:rPr>
+        <w:lastRenderedPageBreak/>
         <w:t>Only legal entities can be members of MICE. Natural persons cannot. For international entities without a U.S. Federal Tax ID, please provide some equivalent that identifies the specific legal entity that is connecting.</w:t>
       </w:r>
     </w:p>
@@ -839,7 +840,6 @@
         <w:rPr>
           <w:rFonts w:ascii="Arial" w:hAnsi="Arial" w:cs="Arial"/>
         </w:rPr>
-        <w:lastRenderedPageBreak/>
         <w:t>Orders will be cancelled if the port is not active (linked and exchanging traffic) within 180 days. MICE can extend this upon request.</w:t>
       </w:r>
     </w:p>
@@ -884,7 +884,7 @@
         </w:tabs>
         <w:rPr>
           <w:rFonts w:ascii="Arial" w:hAnsi="Arial" w:cs="Arial"/>
-          <w:b/>
+          <w:color w:val="000000"/>
         </w:rPr>
       </w:pPr>
       <w:r>
@@ -893,6 +893,198 @@
           <w:b/>
         </w:rPr>
         <w:lastRenderedPageBreak/>
+        <w:t>Provisioning Contact:</w:t>
+      </w:r>
+    </w:p>
+    <w:p>
+      <w:pPr>
+        <w:pStyle w:val="Address"/>
+        <w:tabs>
+          <w:tab w:val="left" w:pos="1440"/>
+        </w:tabs>
+        <w:ind w:left="360"/>
+        <w:rPr>
+          <w:rFonts w:ascii="Arial" w:hAnsi="Arial" w:cs="Arial"/>
+        </w:rPr>
+      </w:pPr>
+      <w:r>
+        <w:rPr>
+          <w:rFonts w:ascii="Arial" w:hAnsi="Arial" w:cs="Arial"/>
+          <w:b/>
+        </w:rPr>
+        <w:t>Name</w:t>
+      </w:r>
+      <w:r>
+        <w:rPr>
+          <w:rFonts w:ascii="Arial" w:hAnsi="Arial" w:cs="Arial"/>
+          <w:b/>
+        </w:rPr>
+        <w:t>:</w:t>
+      </w:r>
+      <w:r>
+        <w:rPr>
+          <w:rFonts w:ascii="Arial" w:hAnsi="Arial" w:cs="Arial"/>
+          <w:b/>
+        </w:rPr>
+        <w:tab/>
+      </w:r>
+      <w:sdt>
+        <w:sdtPr>
+          <w:rPr>
+            <w:rFonts w:ascii="Arial" w:hAnsi="Arial" w:cs="Arial"/>
+            <w:color w:val="000000"/>
+          </w:rPr>
+          <w:id w:val="-40593381"/>
+          <w:placeholder>
+            <w:docPart w:val="2F5F77F8969E45A29B3CF77D8E9A3167"/>
+          </w:placeholder>
+          <w:showingPlcHdr/>
+        </w:sdtPr>
+        <w:sdtContent>
+          <w:r>
+            <w:rPr>
+              <w:rStyle w:val="PlaceholderText"/>
+            </w:rPr>
+            <w:t>Click or tap here to enter text.</w:t>
+          </w:r>
+        </w:sdtContent>
+      </w:sdt>
+    </w:p>
+    <w:p>
+      <w:pPr>
+        <w:pStyle w:val="Address"/>
+        <w:tabs>
+          <w:tab w:val="left" w:pos="1440"/>
+        </w:tabs>
+        <w:ind w:left="360"/>
+        <w:rPr>
+          <w:rFonts w:ascii="Arial" w:hAnsi="Arial" w:cs="Arial"/>
+        </w:rPr>
+      </w:pPr>
+      <w:r>
+        <w:rPr>
+          <w:rFonts w:ascii="Arial" w:hAnsi="Arial" w:cs="Arial"/>
+          <w:b/>
+        </w:rPr>
+        <w:t>Email</w:t>
+      </w:r>
+      <w:r>
+        <w:rPr>
+          <w:rFonts w:ascii="Arial" w:hAnsi="Arial" w:cs="Arial"/>
+          <w:b/>
+        </w:rPr>
+        <w:t>:</w:t>
+      </w:r>
+      <w:r>
+        <w:rPr>
+          <w:rFonts w:ascii="Arial" w:hAnsi="Arial" w:cs="Arial"/>
+          <w:b/>
+        </w:rPr>
+        <w:tab/>
+      </w:r>
+      <w:sdt>
+        <w:sdtPr>
+          <w:rPr>
+            <w:rFonts w:ascii="Arial" w:hAnsi="Arial" w:cs="Arial"/>
+            <w:color w:val="000000"/>
+          </w:rPr>
+          <w:id w:val="1085885394"/>
+          <w:placeholder>
+            <w:docPart w:val="FCBAF2CFC4094486A00F6939B3D46ED3"/>
+          </w:placeholder>
+          <w:showingPlcHdr/>
+        </w:sdtPr>
+        <w:sdtContent>
+          <w:r>
+            <w:rPr>
+              <w:rStyle w:val="PlaceholderText"/>
+            </w:rPr>
+            <w:t>Click or tap here to enter text.</w:t>
+          </w:r>
+        </w:sdtContent>
+      </w:sdt>
+    </w:p>
+    <w:p>
+      <w:pPr>
+        <w:pStyle w:val="Address"/>
+        <w:tabs>
+          <w:tab w:val="left" w:pos="1440"/>
+        </w:tabs>
+        <w:ind w:left="360"/>
+        <w:rPr>
+          <w:rFonts w:ascii="Arial" w:hAnsi="Arial" w:cs="Arial"/>
+        </w:rPr>
+      </w:pPr>
+      <w:r>
+        <w:rPr>
+          <w:rFonts w:ascii="Arial" w:hAnsi="Arial" w:cs="Arial"/>
+          <w:b/>
+        </w:rPr>
+        <w:t>Phone</w:t>
+      </w:r>
+      <w:r>
+        <w:rPr>
+          <w:rFonts w:ascii="Arial" w:hAnsi="Arial" w:cs="Arial"/>
+          <w:b/>
+        </w:rPr>
+        <w:t>:</w:t>
+      </w:r>
+      <w:r>
+        <w:rPr>
+          <w:rFonts w:ascii="Arial" w:hAnsi="Arial" w:cs="Arial"/>
+          <w:b/>
+        </w:rPr>
+        <w:tab/>
+      </w:r>
+      <w:sdt>
+        <w:sdtPr>
+          <w:rPr>
+            <w:rFonts w:ascii="Arial" w:hAnsi="Arial" w:cs="Arial"/>
+            <w:color w:val="000000"/>
+          </w:rPr>
+          <w:id w:val="2004854066"/>
+          <w:placeholder>
+            <w:docPart w:val="71CFBEEED91A4717917DBE3DEE06A6EC"/>
+          </w:placeholder>
+          <w:showingPlcHdr/>
+        </w:sdtPr>
+        <w:sdtContent>
+          <w:r>
+            <w:rPr>
+              <w:rStyle w:val="PlaceholderText"/>
+            </w:rPr>
+            <w:t>Click or tap here to enter text.</w:t>
+          </w:r>
+        </w:sdtContent>
+      </w:sdt>
+    </w:p>
+    <w:p>
+      <w:pPr>
+        <w:pStyle w:val="Address"/>
+        <w:tabs>
+          <w:tab w:val="left" w:pos="1440"/>
+        </w:tabs>
+        <w:rPr>
+          <w:rFonts w:ascii="Arial" w:hAnsi="Arial" w:cs="Arial"/>
+        </w:rPr>
+      </w:pPr>
+    </w:p>
+    <w:p>
+      <w:pPr>
+        <w:pStyle w:val="Address"/>
+        <w:tabs>
+          <w:tab w:val="left" w:pos="1440"/>
+        </w:tabs>
+        <w:rPr>
+          <w:rFonts w:ascii="Arial" w:hAnsi="Arial" w:cs="Arial"/>
+          <w:b/>
+        </w:rPr>
+      </w:pPr>
+      <w:r>
+        <w:rPr>
+          <w:rFonts w:ascii="Arial" w:hAnsi="Arial" w:cs="Arial"/>
+          <w:b/>
+        </w:rPr>
         <w:t>Port Type</w:t>
       </w:r>
       <w:r>
@@ -1477,6 +1669,7 @@
         <w:rPr>
           <w:rFonts w:ascii="Arial" w:hAnsi="Arial" w:cs="Arial"/>
         </w:rPr>
+        <w:lastRenderedPageBreak/>
         <w:t xml:space="preserve">If you are a remote switch operator ordering backhaul ports, please select </w:t>
       </w:r>
       <w:r>
@@ -1883,6 +2076,7 @@
         <w:rPr>
           <w:rFonts w:ascii="Arial" w:hAnsi="Arial" w:cs="Arial"/>
         </w:rPr>
+        <w:lastRenderedPageBreak/>
         <w:t xml:space="preserve">Your downstream ASNs will also need to create </w:t>
       </w:r>
       <w:r>
@@ -1970,14 +2164,7 @@
         <w:rPr>
           <w:rFonts w:ascii="Arial" w:hAnsi="Arial" w:cs="Arial"/>
         </w:rPr>
-        <w:t xml:space="preserve"> you do not list it in PeeringDB, then you </w:t>
-      </w:r>
-      <w:r>
-        <w:rPr>
-          <w:rFonts w:ascii="Arial" w:hAnsi="Arial" w:cs="Arial"/>
-        </w:rPr>
-        <w:lastRenderedPageBreak/>
-        <w:t xml:space="preserve">must inform MICE of your </w:t>
+        <w:t xml:space="preserve"> you do not list it in PeeringDB, then you must inform MICE of your </w:t>
       </w:r>
       <w:r>
         <w:rPr>
@@ -2499,6 +2686,7 @@
           <w:rFonts w:ascii="Arial" w:hAnsi="Arial" w:cs="Arial"/>
           <w:color w:val="000000"/>
         </w:rPr>
+        <w:lastRenderedPageBreak/>
         <w:t>MICE is a 501(c)(12) cooperati</w:t>
       </w:r>
       <w:r>
@@ -2530,15 +2718,7 @@
           <w:rFonts w:ascii="Arial" w:hAnsi="Arial" w:cs="Arial"/>
           <w:color w:val="000000"/>
         </w:rPr>
-        <w:t xml:space="preserve">2-3 times per </w:t>
-      </w:r>
-      <w:r>
-        <w:rPr>
-          <w:rFonts w:ascii="Arial" w:hAnsi="Arial" w:cs="Arial"/>
-          <w:color w:val="000000"/>
-        </w:rPr>
-        <w:lastRenderedPageBreak/>
-        <w:t>year</w:t>
+        <w:t>2-3 times per year</w:t>
       </w:r>
       <w:r>
         <w:rPr>
@@ -3095,6 +3275,7 @@
           <w:rFonts w:ascii="Arial" w:hAnsi="Arial" w:cs="Arial"/>
           <w:color w:val="000000"/>
         </w:rPr>
+        <w:lastRenderedPageBreak/>
         <w:t>Operators must coordinate participant connections and disconnections with MICE. MICE allocates exchange IP addresses and documents participant connections.</w:t>
       </w:r>
     </w:p>
@@ -3116,7 +3297,6 @@
           <w:rFonts w:ascii="Arial" w:hAnsi="Arial" w:cs="Arial"/>
           <w:color w:val="000000"/>
         </w:rPr>
-        <w:lastRenderedPageBreak/>
         <w:t>Operators must inform their participants that the participants are not connecting directly to MICE. The remote switch operator cannot claim to be MICE.</w:t>
       </w:r>
     </w:p>
@@ -3409,6 +3589,7 @@
           <w:rFonts w:ascii="Arial" w:hAnsi="Arial" w:cs="Arial"/>
           <w:color w:val="000000"/>
         </w:rPr>
+        <w:lastRenderedPageBreak/>
         <w:t>Mid-year changes will be pro-rated to the day the new port is ready on the MICE side. The pro-rated credit from the old port(s) will offset the pro-rated charges from the new por</w:t>
       </w:r>
       <w:r>
@@ -3456,15 +3637,7 @@
           <w:rFonts w:ascii="Arial" w:hAnsi="Arial" w:cs="Arial"/>
           <w:color w:val="000000"/>
         </w:rPr>
-        <w:t xml:space="preserve">MICE may disconnect a port (and expel a member) at any time, with notice per </w:t>
-      </w:r>
-      <w:r>
-        <w:rPr>
-          <w:rFonts w:ascii="Arial" w:hAnsi="Arial" w:cs="Arial"/>
-          <w:color w:val="000000"/>
-        </w:rPr>
-        <w:lastRenderedPageBreak/>
-        <w:t>the procedure outlined in the bylaws</w:t>
+        <w:t>MICE may disconnect a port (and expel a member) at any time, with notice per the procedure outlined in the bylaws</w:t>
       </w:r>
       <w:r>
         <w:rPr>
@@ -4005,7 +4178,7 @@
         <w:sz w:val="16"/>
         <w:szCs w:val="16"/>
       </w:rPr>
-      <w:t>5</w:t>
+      <w:t>6</w:t>
     </w:r>
     <w:r>
       <w:rPr>
@@ -4021,7 +4194,7 @@
         <w:sz w:val="16"/>
         <w:szCs w:val="16"/>
       </w:rPr>
-      <w:t>01</w:t>
+      <w:t>0</w:t>
     </w:r>
     <w:r>
       <w:rPr>
@@ -4029,15 +4202,7 @@
         <w:sz w:val="16"/>
         <w:szCs w:val="16"/>
       </w:rPr>
-      <w:t>-</w:t>
-    </w:r>
-    <w:r>
-      <w:rPr>
-        <w:rFonts w:ascii="Arial" w:hAnsi="Arial" w:cs="Arial"/>
-        <w:sz w:val="16"/>
-        <w:szCs w:val="16"/>
-      </w:rPr>
-      <w:t>20</w:t>
+      <w:t>2-01</w:t>
     </w:r>
   </w:p>
 </w:ftr>
@@ -4089,7 +4254,7 @@
       <w:rPr>
         <w:noProof/>
       </w:rPr>
-      <w:t>6</w:t>
+      <w:t>2</w:t>
     </w:r>
     <w:r>
       <w:fldChar w:fldCharType="end"/>
@@ -5986,6 +6151,93 @@
         </w:p>
       </w:docPartBody>
     </w:docPart>
+    <w:docPart>
+      <w:docPartPr>
+        <w:name w:val="2F5F77F8969E45A29B3CF77D8E9A3167"/>
+        <w:category>
+          <w:name w:val="General"/>
+          <w:gallery w:val="placeholder"/>
+        </w:category>
+        <w:types>
+          <w:type w:val="bbPlcHdr"/>
+        </w:types>
+        <w:behaviors>
+          <w:behavior w:val="content"/>
+        </w:behaviors>
+        <w:guid w:val="{B82A3207-7200-4629-B374-77A0112475DF}"/>
+      </w:docPartPr>
+      <w:docPartBody>
+        <w:p>
+          <w:pPr>
+            <w:pStyle w:val="2F5F77F8969E45A29B3CF77D8E9A3167"/>
+          </w:pPr>
+          <w:r>
+            <w:rPr>
+              <w:rStyle w:val="PlaceholderText"/>
+            </w:rPr>
+            <w:t>Click or tap here to enter text.</w:t>
+          </w:r>
+        </w:p>
+      </w:docPartBody>
+    </w:docPart>
+    <w:docPart>
+      <w:docPartPr>
+        <w:name w:val="FCBAF2CFC4094486A00F6939B3D46ED3"/>
+        <w:category>
+          <w:name w:val="General"/>
+          <w:gallery w:val="placeholder"/>
+        </w:category>
+        <w:types>
+          <w:type w:val="bbPlcHdr"/>
+        </w:types>
+        <w:behaviors>
+          <w:behavior w:val="content"/>
+        </w:behaviors>
+        <w:guid w:val="{5DCE6BAD-F9B4-4BAA-B853-2246063899B6}"/>
+      </w:docPartPr>
+      <w:docPartBody>
+        <w:p>
+          <w:pPr>
+            <w:pStyle w:val="FCBAF2CFC4094486A00F6939B3D46ED3"/>
+          </w:pPr>
+          <w:r>
+            <w:rPr>
+              <w:rStyle w:val="PlaceholderText"/>
+            </w:rPr>
+            <w:t>Click or tap here to enter text.</w:t>
+          </w:r>
+        </w:p>
+      </w:docPartBody>
+    </w:docPart>
+    <w:docPart>
+      <w:docPartPr>
+        <w:name w:val="71CFBEEED91A4717917DBE3DEE06A6EC"/>
+        <w:category>
+          <w:name w:val="General"/>
+          <w:gallery w:val="placeholder"/>
+        </w:category>
+        <w:types>
+          <w:type w:val="bbPlcHdr"/>
+        </w:types>
+        <w:behaviors>
+          <w:behavior w:val="content"/>
+        </w:behaviors>
+        <w:guid w:val="{82C656EC-E40D-4EF7-961B-E690ECFC62FA}"/>
+      </w:docPartPr>
+      <w:docPartBody>
+        <w:p>
+          <w:pPr>
+            <w:pStyle w:val="71CFBEEED91A4717917DBE3DEE06A6EC"/>
+          </w:pPr>
+          <w:r>
+            <w:rPr>
+              <w:rStyle w:val="PlaceholderText"/>
+            </w:rPr>
+            <w:t>Click or tap here to enter text.</w:t>
+          </w:r>
+        </w:p>
+      </w:docPartBody>
+    </w:docPart>
   </w:docParts>
 </w:glossaryDocument>
 </file>
@@ -6025,7 +6277,7 @@
     <w:charset w:val="00"/>
     <w:family w:val="swiss"/>
     <w:pitch w:val="variable"/>
-    <w:sig w:usb0="E4002EFF" w:usb1="C000247B" w:usb2="00000009" w:usb3="00000000" w:csb0="000001FF" w:csb1="00000000"/>
+    <w:sig w:usb0="E4002EFF" w:usb1="C200247B" w:usb2="00000009" w:usb3="00000000" w:csb0="000001FF" w:csb1="00000000"/>
   </w:font>
   <w:font w:name="Cambria">
     <w:panose1 w:val="02040503050406030204"/>
@@ -6053,7 +6305,7 @@
     <w:charset w:val="00"/>
     <w:family w:val="swiss"/>
     <w:pitch w:val="variable"/>
-    <w:sig w:usb0="E4002EFF" w:usb1="C000247B" w:usb2="00000009" w:usb3="00000000" w:csb0="000001FF" w:csb1="00000000"/>
+    <w:sig w:usb0="E4002EFF" w:usb1="C200247B" w:usb2="00000009" w:usb3="00000000" w:csb0="000001FF" w:csb1="00000000"/>
   </w:font>
 </w:fonts>
 </file>
@@ -6088,6 +6340,7 @@
     <w:rsid w:val="009939EB"/>
     <w:rsid w:val="00996CA3"/>
     <w:rsid w:val="00AE1380"/>
+    <w:rsid w:val="00B43F88"/>
     <w:rsid w:val="00CB43F2"/>
     <w:rsid w:val="00DA21E0"/>
     <w:rsid w:val="00E30ACE"/>
@@ -6554,7 +6807,7 @@
     <w:name w:val="Placeholder Text"/>
     <w:basedOn w:val="DefaultParagraphFont"/>
     <w:uiPriority w:val="2"/>
-    <w:rsid w:val="00E96A92"/>
+    <w:rsid w:val="00B43F88"/>
     <w:rPr>
       <w:color w:val="808080"/>
     </w:rPr>
@@ -7455,6 +7708,38 @@
   <w:style w:type="paragraph" w:customStyle="1" w:styleId="35A4E06ABFFC41038F4F53AFCEEF5E6B">
     <w:name w:val="35A4E06ABFFC41038F4F53AFCEEF5E6B"/>
     <w:rsid w:val="00E96A92"/>
+  </w:style>
+  <w:style w:type="paragraph" w:customStyle="1" w:styleId="E02D24C73EED459F830B30B6C961EC38">
+    <w:name w:val="E02D24C73EED459F830B30B6C961EC38"/>
+    <w:rsid w:val="00B43F88"/>
+  </w:style>
+  <w:style w:type="paragraph" w:customStyle="1" w:styleId="D0CA3D822A7342BDB5ED7C5B52C20FC5">
+    <w:name w:val="D0CA3D822A7342BDB5ED7C5B52C20FC5"/>
+    <w:rsid w:val="00B43F88"/>
+  </w:style>
+  <w:style w:type="paragraph" w:customStyle="1" w:styleId="DDB0D4641BE1487BA52DCFC441AE641C">
+    <w:name w:val="DDB0D4641BE1487BA52DCFC441AE641C"/>
+    <w:rsid w:val="00B43F88"/>
+  </w:style>
+  <w:style w:type="paragraph" w:customStyle="1" w:styleId="C5826DB76F4343BDABCB9F939AF8B9EA">
+    <w:name w:val="C5826DB76F4343BDABCB9F939AF8B9EA"/>
+    <w:rsid w:val="00B43F88"/>
+  </w:style>
+  <w:style w:type="paragraph" w:customStyle="1" w:styleId="2F5F77F8969E45A29B3CF77D8E9A3167">
+    <w:name w:val="2F5F77F8969E45A29B3CF77D8E9A3167"/>
+    <w:rsid w:val="00B43F88"/>
+  </w:style>
+  <w:style w:type="paragraph" w:customStyle="1" w:styleId="FCBAF2CFC4094486A00F6939B3D46ED3">
+    <w:name w:val="FCBAF2CFC4094486A00F6939B3D46ED3"/>
+    <w:rsid w:val="00B43F88"/>
+  </w:style>
+  <w:style w:type="paragraph" w:customStyle="1" w:styleId="71CFBEEED91A4717917DBE3DEE06A6EC">
+    <w:name w:val="71CFBEEED91A4717917DBE3DEE06A6EC"/>
+    <w:rsid w:val="00B43F88"/>
+  </w:style>
+  <w:style w:type="paragraph" w:customStyle="1" w:styleId="C3A90D55A8254A94A2030333AEF231C7">
+    <w:name w:val="C3A90D55A8254A94A2030333AEF231C7"/>
+    <w:rsid w:val="00B43F88"/>
   </w:style>
 </w:styles>
 </file>
@@ -7763,6 +8048,12 @@
 </file>
 
 <file path=customXml/item2.xml><?xml version="1.0" encoding="utf-8"?>
+<p:properties xmlns:p="http://schemas.microsoft.com/office/2006/metadata/properties" xmlns:xsi="http://www.w3.org/2001/XMLSchema-instance" xmlns:pc="http://schemas.microsoft.com/office/infopath/2007/PartnerControls">
+  <documentManagement/>
+</p:properties>
+</file>
+
+<file path=customXml/item3.xml><?xml version="1.0" encoding="utf-8"?>
 <ct:contentTypeSchema xmlns:ct="http://schemas.microsoft.com/office/2006/metadata/contentType" xmlns:ma="http://schemas.microsoft.com/office/2006/metadata/properties/metaAttributes" ct:_="" ma:_="" ma:contentTypeName="Document" ma:contentTypeID="0x010100DC79E3681DCC084A878C9CCDD1797ED4" ma:contentTypeVersion="1" ma:contentTypeDescription="Create a new document." ma:contentTypeScope="" ma:versionID="4ce5778d165c9407ce7c62dce0730303">
   <xsd:schema xmlns:xsd="http://www.w3.org/2001/XMLSchema" xmlns:xs="http://www.w3.org/2001/XMLSchema" xmlns:p="http://schemas.microsoft.com/office/2006/metadata/properties" xmlns:ns3="edf48ee5-d2a0-4f04-99f4-0eb27cdb7c0d" targetNamespace="http://schemas.microsoft.com/office/2006/metadata/properties" ma:root="true" ma:fieldsID="30df76a92c322e39696810b53868c288" ns3:_="">
     <xsd:import namespace="edf48ee5-d2a0-4f04-99f4-0eb27cdb7c0d"/>
@@ -7902,12 +8193,6 @@
 </ct:contentTypeSchema>
 </file>
 
-<file path=customXml/item3.xml><?xml version="1.0" encoding="utf-8"?>
-<p:properties xmlns:p="http://schemas.microsoft.com/office/2006/metadata/properties" xmlns:xsi="http://www.w3.org/2001/XMLSchema-instance" xmlns:pc="http://schemas.microsoft.com/office/infopath/2007/PartnerControls">
-  <documentManagement/>
-</p:properties>
-</file>
-
 <file path=customXml/item4.xml><?xml version="1.0" encoding="utf-8"?>
 <?mso-contentType ?>
 <FormTemplates xmlns="http://schemas.microsoft.com/sharepoint/v3/contenttype/forms">
@@ -7930,6 +8215,15 @@
 </file>
 
 <file path=customXml/itemProps2.xml><?xml version="1.0" encoding="utf-8"?>
+<ds:datastoreItem xmlns:ds="http://schemas.openxmlformats.org/officeDocument/2006/customXml" ds:itemID="{4E8DC2B8-F18C-4446-9EE4-D1204856FBD6}">
+  <ds:schemaRefs>
+    <ds:schemaRef ds:uri="http://schemas.microsoft.com/office/2006/metadata/properties"/>
+    <ds:schemaRef ds:uri="http://schemas.microsoft.com/office/infopath/2007/PartnerControls"/>
+  </ds:schemaRefs>
+</ds:datastoreItem>
+</file>
+
+<file path=customXml/itemProps3.xml><?xml version="1.0" encoding="utf-8"?>
 <ds:datastoreItem xmlns:ds="http://schemas.openxmlformats.org/officeDocument/2006/customXml" ds:itemID="{E1B3CF67-5E98-44FD-A586-2CE5B9D80333}">
   <ds:schemaRefs>
     <ds:schemaRef ds:uri="http://schemas.microsoft.com/office/2006/metadata/contentType"/>
@@ -7947,15 +8241,6 @@
 </ds:datastoreItem>
 </file>
 
-<file path=customXml/itemProps3.xml><?xml version="1.0" encoding="utf-8"?>
-<ds:datastoreItem xmlns:ds="http://schemas.openxmlformats.org/officeDocument/2006/customXml" ds:itemID="{4E8DC2B8-F18C-4446-9EE4-D1204856FBD6}">
-  <ds:schemaRefs>
-    <ds:schemaRef ds:uri="http://schemas.microsoft.com/office/2006/metadata/properties"/>
-    <ds:schemaRef ds:uri="http://schemas.microsoft.com/office/infopath/2007/PartnerControls"/>
-  </ds:schemaRefs>
-</ds:datastoreItem>
-</file>
-
 <file path=customXml/itemProps4.xml><?xml version="1.0" encoding="utf-8"?>
 <ds:datastoreItem xmlns:ds="http://schemas.openxmlformats.org/officeDocument/2006/customXml" ds:itemID="{E0CD3344-CEC1-47E2-87E4-477E77BC6903}">
   <ds:schemaRefs>
@@ -7965,7 +8250,7 @@
 </file>
 
 <file path=customXml/itemProps5.xml><?xml version="1.0" encoding="utf-8"?>
-<ds:datastoreItem xmlns:ds="http://schemas.openxmlformats.org/officeDocument/2006/customXml" ds:itemID="{BC25DBF8-FA16-44D3-89F3-2E08FE725EA6}">
+<ds:datastoreItem xmlns:ds="http://schemas.openxmlformats.org/officeDocument/2006/customXml" ds:itemID="{4D69E287-402A-4A34-A6F1-DC53360BDCBF}">
   <ds:schemaRefs>
     <ds:schemaRef ds:uri="http://schemas.openxmlformats.org/officeDocument/2006/bibliography"/>
   </ds:schemaRefs>

</xml_diff>

<commit_message>
Order Form: Make various changes
The main changes here are to reference section 1.16 (or parts thereof) of the
bylaws to clarify how disconnection notices work.

I also added wording that amounts to "Net 30".

This came up during legal review by a potential participant.

I also added "10G" to the note about the four port limit.  This should be clear
from context, but I made it explicit.
</commit_message>
<xml_diff>
--- a/files/MICE Order Form.docx
+++ b/files/MICE Order Form.docx
@@ -940,6 +940,7 @@
           </w:placeholder>
           <w:showingPlcHdr/>
         </w:sdtPr>
+        <w:sdtEndPr/>
         <w:sdtContent>
           <w:r>
             <w:rPr>
@@ -994,6 +995,7 @@
           </w:placeholder>
           <w:showingPlcHdr/>
         </w:sdtPr>
+        <w:sdtEndPr/>
         <w:sdtContent>
           <w:r>
             <w:rPr>
@@ -1048,6 +1050,7 @@
           </w:placeholder>
           <w:showingPlcHdr/>
         </w:sdtPr>
+        <w:sdtEndPr/>
         <w:sdtContent>
           <w:r>
             <w:rPr>
@@ -1631,6 +1634,7 @@
         <w:rPr>
           <w:rFonts w:ascii="Arial" w:hAnsi="Arial" w:cs="Arial"/>
         </w:rPr>
+        <w:lastRenderedPageBreak/>
         <w:t>Port graphs are available at the address below (which is also linked from the MICE website). Use the username “guest” and password “guest” for access.</w:t>
       </w:r>
       <w:r>
@@ -1669,7 +1673,6 @@
         <w:rPr>
           <w:rFonts w:ascii="Arial" w:hAnsi="Arial" w:cs="Arial"/>
         </w:rPr>
-        <w:lastRenderedPageBreak/>
         <w:t xml:space="preserve">If you are a remote switch operator ordering backhaul ports, please select </w:t>
       </w:r>
       <w:r>
@@ -2076,7 +2079,6 @@
         <w:rPr>
           <w:rFonts w:ascii="Arial" w:hAnsi="Arial" w:cs="Arial"/>
         </w:rPr>
-        <w:lastRenderedPageBreak/>
         <w:t xml:space="preserve">Your downstream ASNs will also need to create </w:t>
       </w:r>
       <w:r>
@@ -2122,6 +2124,7 @@
         <w:rPr>
           <w:rFonts w:ascii="Arial" w:hAnsi="Arial" w:cs="Arial"/>
         </w:rPr>
+        <w:lastRenderedPageBreak/>
         <w:t xml:space="preserve">Reference your </w:t>
       </w:r>
       <w:r>
@@ -2592,7 +2595,35 @@
           <w:rFonts w:ascii="Arial" w:hAnsi="Arial" w:cs="Arial"/>
           <w:color w:val="000000"/>
         </w:rPr>
-        <w:t xml:space="preserve">per the procedure outlined in the bylaws, which are linked from: </w:t>
+        <w:t>per the procedure</w:t>
+      </w:r>
+      <w:r>
+        <w:rPr>
+          <w:rFonts w:ascii="Arial" w:hAnsi="Arial" w:cs="Arial"/>
+          <w:color w:val="000000"/>
+        </w:rPr>
+        <w:t>s</w:t>
+      </w:r>
+      <w:r>
+        <w:rPr>
+          <w:rFonts w:ascii="Arial" w:hAnsi="Arial" w:cs="Arial"/>
+          <w:color w:val="000000"/>
+        </w:rPr>
+        <w:t xml:space="preserve"> outlined in </w:t>
+      </w:r>
+      <w:r>
+        <w:rPr>
+          <w:rFonts w:ascii="Arial" w:hAnsi="Arial" w:cs="Arial"/>
+          <w:color w:val="000000"/>
+        </w:rPr>
+        <w:t xml:space="preserve">section 1.16 of </w:t>
+      </w:r>
+      <w:r>
+        <w:rPr>
+          <w:rFonts w:ascii="Arial" w:hAnsi="Arial" w:cs="Arial"/>
+          <w:color w:val="000000"/>
+        </w:rPr>
+        <w:t xml:space="preserve">the bylaws, which are linked from: </w:t>
       </w:r>
       <w:hyperlink r:id="rId26" w:history="1">
         <w:r>
@@ -2686,31 +2717,31 @@
           <w:rFonts w:ascii="Arial" w:hAnsi="Arial" w:cs="Arial"/>
           <w:color w:val="000000"/>
         </w:rPr>
+        <w:t>MICE is a 501(c)(12) cooperati</w:t>
+      </w:r>
+      <w:r>
+        <w:rPr>
+          <w:rFonts w:ascii="Arial" w:hAnsi="Arial" w:cs="Arial"/>
+          <w:color w:val="000000"/>
+        </w:rPr>
+        <w:t>ve governed by its members.</w:t>
+      </w:r>
+    </w:p>
+    <w:p>
+      <w:pPr>
+        <w:pStyle w:val="Address"/>
+        <w:spacing w:before="240" w:after="240"/>
+        <w:rPr>
+          <w:rFonts w:ascii="Arial" w:hAnsi="Arial" w:cs="Arial"/>
+          <w:color w:val="000000"/>
+        </w:rPr>
+      </w:pPr>
+      <w:r>
+        <w:rPr>
+          <w:rFonts w:ascii="Arial" w:hAnsi="Arial" w:cs="Arial"/>
+          <w:color w:val="000000"/>
+        </w:rPr>
         <w:lastRenderedPageBreak/>
-        <w:t>MICE is a 501(c)(12) cooperati</w:t>
-      </w:r>
-      <w:r>
-        <w:rPr>
-          <w:rFonts w:ascii="Arial" w:hAnsi="Arial" w:cs="Arial"/>
-          <w:color w:val="000000"/>
-        </w:rPr>
-        <w:t>ve governed by its members.</w:t>
-      </w:r>
-    </w:p>
-    <w:p>
-      <w:pPr>
-        <w:pStyle w:val="Address"/>
-        <w:spacing w:before="240" w:after="240"/>
-        <w:rPr>
-          <w:rFonts w:ascii="Arial" w:hAnsi="Arial" w:cs="Arial"/>
-          <w:color w:val="000000"/>
-        </w:rPr>
-      </w:pPr>
-      <w:r>
-        <w:rPr>
-          <w:rFonts w:ascii="Arial" w:hAnsi="Arial" w:cs="Arial"/>
-          <w:color w:val="000000"/>
-        </w:rPr>
         <w:t xml:space="preserve">MICE holds member meetings, which are called User Group (UG) meetings. These meetings are typically held </w:t>
       </w:r>
       <w:r>
@@ -2939,25 +2970,6 @@
           <w:color w:val="000000"/>
         </w:rPr>
         <w:t xml:space="preserve"> during the 12-month period preceding the incident.</w:t>
-      </w:r>
-    </w:p>
-    <w:p>
-      <w:pPr>
-        <w:pStyle w:val="Address"/>
-        <w:spacing w:before="240" w:after="240"/>
-        <w:rPr>
-          <w:rFonts w:ascii="Arial" w:hAnsi="Arial" w:cs="Arial"/>
-          <w:color w:val="000000"/>
-        </w:rPr>
-      </w:pPr>
-      <w:r>
-        <w:rPr>
-          <w:rFonts w:ascii="Arial" w:hAnsi="Arial" w:cs="Arial"/>
-          <w:b/>
-          <w:sz w:val="22"/>
-          <w:szCs w:val="22"/>
-        </w:rPr>
-        <w:br w:type="page"/>
       </w:r>
     </w:p>
     <w:p>
@@ -3396,6 +3408,13 @@
         </w:rPr>
         <w:t>o refunds will be given.</w:t>
       </w:r>
+      <w:r>
+        <w:rPr>
+          <w:rFonts w:ascii="Arial" w:hAnsi="Arial" w:cs="Arial"/>
+          <w:color w:val="000000"/>
+        </w:rPr>
+        <w:t xml:space="preserve"> Payment is due on undisputed and properly itemized invoices within 30 days after receipt of the invoice.</w:t>
+      </w:r>
     </w:p>
     <w:p>
       <w:pPr>
@@ -3470,7 +3489,21 @@
           <w:rFonts w:ascii="Arial" w:hAnsi="Arial" w:cs="Arial"/>
           <w:color w:val="000000"/>
         </w:rPr>
-        <w:t>/year. More than four ports requires board approval.</w:t>
+        <w:t>/year. More than four</w:t>
+      </w:r>
+      <w:r>
+        <w:rPr>
+          <w:rFonts w:ascii="Arial" w:hAnsi="Arial" w:cs="Arial"/>
+          <w:color w:val="000000"/>
+        </w:rPr>
+        <w:t xml:space="preserve"> 10G</w:t>
+      </w:r>
+      <w:r>
+        <w:rPr>
+          <w:rFonts w:ascii="Arial" w:hAnsi="Arial" w:cs="Arial"/>
+          <w:color w:val="000000"/>
+        </w:rPr>
+        <w:t xml:space="preserve"> ports requires board approval.</w:t>
       </w:r>
     </w:p>
     <w:p>
@@ -3572,8 +3605,35 @@
         <w:rPr>
           <w:rFonts w:ascii="Arial" w:hAnsi="Arial" w:cs="Arial"/>
         </w:rPr>
-        <w:t>Upgrades will be held if the participant is past due on existing billing. Ports are subject to disconnection (and termination of membership) if past due.</w:t>
-      </w:r>
+        <w:t xml:space="preserve">Upgrades will be held if the participant is past due on existing billing. Ports are subject to disconnection (and </w:t>
+      </w:r>
+      <w:r>
+        <w:rPr>
+          <w:rFonts w:ascii="Arial" w:hAnsi="Arial" w:cs="Arial"/>
+        </w:rPr>
+        <w:t>the member expelled</w:t>
+      </w:r>
+      <w:r>
+        <w:rPr>
+          <w:rFonts w:ascii="Arial" w:hAnsi="Arial" w:cs="Arial"/>
+        </w:rPr>
+        <w:t>) if past du</w:t>
+      </w:r>
+      <w:r>
+        <w:rPr>
+          <w:rFonts w:ascii="Arial" w:hAnsi="Arial" w:cs="Arial"/>
+        </w:rPr>
+        <w:t xml:space="preserve">e, per section 1.16(b) of the bylaws, which are linked from: </w:t>
+      </w:r>
+      <w:hyperlink r:id="rId29" w:history="1">
+        <w:r>
+          <w:rPr>
+            <w:rStyle w:val="Hyperlink"/>
+            <w:rFonts w:ascii="Arial" w:hAnsi="Arial" w:cs="Arial"/>
+          </w:rPr>
+          <w:t>https://micemn.net/resources.html</w:t>
+        </w:r>
+      </w:hyperlink>
     </w:p>
     <w:p>
       <w:pPr>
@@ -3589,34 +3649,34 @@
           <w:rFonts w:ascii="Arial" w:hAnsi="Arial" w:cs="Arial"/>
           <w:color w:val="000000"/>
         </w:rPr>
+        <w:t>Mid-year changes will be pro-rated to the day the new port is ready on the MICE side. The pro-rated credit from the old port(s) will offset the pro-rated charges from the new por</w:t>
+      </w:r>
+      <w:r>
+        <w:rPr>
+          <w:rFonts w:ascii="Arial" w:hAnsi="Arial" w:cs="Arial"/>
+          <w:color w:val="000000"/>
+        </w:rPr>
+        <w:t>t(s).</w:t>
+      </w:r>
+    </w:p>
+    <w:p>
+      <w:pPr>
+        <w:pStyle w:val="Address"/>
+        <w:spacing w:before="240" w:after="240"/>
+        <w:rPr>
+          <w:rFonts w:ascii="Arial" w:hAnsi="Arial" w:cs="Arial"/>
+          <w:color w:val="000000"/>
+        </w:rPr>
+      </w:pPr>
+      <w:r>
+        <w:rPr>
+          <w:rFonts w:ascii="Arial" w:hAnsi="Arial" w:cs="Arial"/>
+          <w:color w:val="000000"/>
+        </w:rPr>
         <w:lastRenderedPageBreak/>
-        <w:t>Mid-year changes will be pro-rated to the day the new port is ready on the MICE side. The pro-rated credit from the old port(s) will offset the pro-rated charges from the new por</w:t>
-      </w:r>
-      <w:r>
-        <w:rPr>
-          <w:rFonts w:ascii="Arial" w:hAnsi="Arial" w:cs="Arial"/>
-          <w:color w:val="000000"/>
-        </w:rPr>
-        <w:t>t(s).</w:t>
-      </w:r>
-    </w:p>
-    <w:p>
-      <w:pPr>
-        <w:pStyle w:val="Address"/>
-        <w:spacing w:before="240" w:after="240"/>
-        <w:rPr>
-          <w:rFonts w:ascii="Arial" w:hAnsi="Arial" w:cs="Arial"/>
-          <w:color w:val="000000"/>
-        </w:rPr>
-      </w:pPr>
-      <w:r>
-        <w:rPr>
-          <w:rFonts w:ascii="Arial" w:hAnsi="Arial" w:cs="Arial"/>
-          <w:color w:val="000000"/>
-        </w:rPr>
         <w:t xml:space="preserve">Participants may disconnect (and resign membership) at any time by notifying </w:t>
       </w:r>
-      <w:hyperlink r:id="rId29" w:history="1">
+      <w:hyperlink r:id="rId30" w:history="1">
         <w:r>
           <w:rPr>
             <w:rStyle w:val="Hyperlink"/>
@@ -3630,38 +3690,43 @@
           <w:rFonts w:ascii="Arial" w:hAnsi="Arial" w:cs="Arial"/>
           <w:color w:val="000000"/>
         </w:rPr>
-        <w:t xml:space="preserve">. </w:t>
-      </w:r>
-      <w:r>
-        <w:rPr>
-          <w:rFonts w:ascii="Arial" w:hAnsi="Arial" w:cs="Arial"/>
-          <w:color w:val="000000"/>
-        </w:rPr>
-        <w:t>MICE may disconnect a port (and expel a member) at any time, with notice per the procedure outlined in the bylaws</w:t>
-      </w:r>
-      <w:r>
-        <w:rPr>
-          <w:rFonts w:ascii="Arial" w:hAnsi="Arial" w:cs="Arial"/>
-          <w:color w:val="000000"/>
-        </w:rPr>
-        <w:t>, which</w:t>
-      </w:r>
-      <w:r>
-        <w:rPr>
-          <w:rFonts w:ascii="Arial" w:hAnsi="Arial" w:cs="Arial"/>
-          <w:color w:val="000000"/>
-        </w:rPr>
-        <w:t xml:space="preserve"> are linked from: </w:t>
-      </w:r>
-      <w:hyperlink r:id="rId30" w:history="1">
-        <w:r>
-          <w:rPr>
-            <w:rStyle w:val="Hyperlink"/>
-            <w:rFonts w:ascii="Arial" w:hAnsi="Arial" w:cs="Arial"/>
-          </w:rPr>
-          <w:t>https://micemn.net/resources.html</w:t>
-        </w:r>
-      </w:hyperlink>
+        <w:t xml:space="preserve"> per section 1.16(a) of the bylaws.</w:t>
+      </w:r>
+      <w:r>
+        <w:rPr>
+          <w:rFonts w:ascii="Arial" w:hAnsi="Arial" w:cs="Arial"/>
+          <w:color w:val="000000"/>
+        </w:rPr>
+        <w:t xml:space="preserve"> </w:t>
+      </w:r>
+      <w:r>
+        <w:rPr>
+          <w:rFonts w:ascii="Arial" w:hAnsi="Arial" w:cs="Arial"/>
+          <w:color w:val="000000"/>
+        </w:rPr>
+        <w:t>MICE may disconnect a port (and expel a member) at any time, with notice per the procedure outlined in</w:t>
+      </w:r>
+      <w:r>
+        <w:rPr>
+          <w:rFonts w:ascii="Arial" w:hAnsi="Arial" w:cs="Arial"/>
+          <w:color w:val="000000"/>
+        </w:rPr>
+        <w:t xml:space="preserve"> section 1.16(c) of</w:t>
+      </w:r>
+      <w:r>
+        <w:rPr>
+          <w:rFonts w:ascii="Arial" w:hAnsi="Arial" w:cs="Arial"/>
+          <w:color w:val="000000"/>
+        </w:rPr>
+        <w:t xml:space="preserve"> the bylaws</w:t>
+      </w:r>
+      <w:r>
+        <w:rPr>
+          <w:rFonts w:ascii="Arial" w:hAnsi="Arial" w:cs="Arial"/>
+          <w:color w:val="000000"/>
+        </w:rPr>
+        <w:t>.</w:t>
+      </w:r>
     </w:p>
     <w:p>
       <w:pPr>
@@ -4202,7 +4267,23 @@
         <w:sz w:val="16"/>
         <w:szCs w:val="16"/>
       </w:rPr>
-      <w:t>2-01</w:t>
+      <w:t>5</w:t>
+    </w:r>
+    <w:r>
+      <w:rPr>
+        <w:rFonts w:ascii="Arial" w:hAnsi="Arial" w:cs="Arial"/>
+        <w:sz w:val="16"/>
+        <w:szCs w:val="16"/>
+      </w:rPr>
+      <w:t>-</w:t>
+    </w:r>
+    <w:r>
+      <w:rPr>
+        <w:rFonts w:ascii="Arial" w:hAnsi="Arial" w:cs="Arial"/>
+        <w:sz w:val="16"/>
+        <w:szCs w:val="16"/>
+      </w:rPr>
+      <w:t>19</w:t>
     </w:r>
   </w:p>
 </w:ftr>
@@ -6330,6 +6411,7 @@
     <w:rsid w:val="00160245"/>
     <w:rsid w:val="002231B2"/>
     <w:rsid w:val="00386FDE"/>
+    <w:rsid w:val="005271D9"/>
     <w:rsid w:val="00567118"/>
     <w:rsid w:val="00572955"/>
     <w:rsid w:val="00637199"/>
@@ -8048,12 +8130,6 @@
 </file>
 
 <file path=customXml/item2.xml><?xml version="1.0" encoding="utf-8"?>
-<p:properties xmlns:p="http://schemas.microsoft.com/office/2006/metadata/properties" xmlns:xsi="http://www.w3.org/2001/XMLSchema-instance" xmlns:pc="http://schemas.microsoft.com/office/infopath/2007/PartnerControls">
-  <documentManagement/>
-</p:properties>
-</file>
-
-<file path=customXml/item3.xml><?xml version="1.0" encoding="utf-8"?>
 <ct:contentTypeSchema xmlns:ct="http://schemas.microsoft.com/office/2006/metadata/contentType" xmlns:ma="http://schemas.microsoft.com/office/2006/metadata/properties/metaAttributes" ct:_="" ma:_="" ma:contentTypeName="Document" ma:contentTypeID="0x010100DC79E3681DCC084A878C9CCDD1797ED4" ma:contentTypeVersion="1" ma:contentTypeDescription="Create a new document." ma:contentTypeScope="" ma:versionID="4ce5778d165c9407ce7c62dce0730303">
   <xsd:schema xmlns:xsd="http://www.w3.org/2001/XMLSchema" xmlns:xs="http://www.w3.org/2001/XMLSchema" xmlns:p="http://schemas.microsoft.com/office/2006/metadata/properties" xmlns:ns3="edf48ee5-d2a0-4f04-99f4-0eb27cdb7c0d" targetNamespace="http://schemas.microsoft.com/office/2006/metadata/properties" ma:root="true" ma:fieldsID="30df76a92c322e39696810b53868c288" ns3:_="">
     <xsd:import namespace="edf48ee5-d2a0-4f04-99f4-0eb27cdb7c0d"/>
@@ -8193,6 +8269,12 @@
 </ct:contentTypeSchema>
 </file>
 
+<file path=customXml/item3.xml><?xml version="1.0" encoding="utf-8"?>
+<p:properties xmlns:p="http://schemas.microsoft.com/office/2006/metadata/properties" xmlns:xsi="http://www.w3.org/2001/XMLSchema-instance" xmlns:pc="http://schemas.microsoft.com/office/infopath/2007/PartnerControls">
+  <documentManagement/>
+</p:properties>
+</file>
+
 <file path=customXml/item4.xml><?xml version="1.0" encoding="utf-8"?>
 <?mso-contentType ?>
 <FormTemplates xmlns="http://schemas.microsoft.com/sharepoint/v3/contenttype/forms">
@@ -8215,15 +8297,6 @@
 </file>
 
 <file path=customXml/itemProps2.xml><?xml version="1.0" encoding="utf-8"?>
-<ds:datastoreItem xmlns:ds="http://schemas.openxmlformats.org/officeDocument/2006/customXml" ds:itemID="{4E8DC2B8-F18C-4446-9EE4-D1204856FBD6}">
-  <ds:schemaRefs>
-    <ds:schemaRef ds:uri="http://schemas.microsoft.com/office/2006/metadata/properties"/>
-    <ds:schemaRef ds:uri="http://schemas.microsoft.com/office/infopath/2007/PartnerControls"/>
-  </ds:schemaRefs>
-</ds:datastoreItem>
-</file>
-
-<file path=customXml/itemProps3.xml><?xml version="1.0" encoding="utf-8"?>
 <ds:datastoreItem xmlns:ds="http://schemas.openxmlformats.org/officeDocument/2006/customXml" ds:itemID="{E1B3CF67-5E98-44FD-A586-2CE5B9D80333}">
   <ds:schemaRefs>
     <ds:schemaRef ds:uri="http://schemas.microsoft.com/office/2006/metadata/contentType"/>
@@ -8241,6 +8314,22 @@
 </ds:datastoreItem>
 </file>
 
+<file path=customXml/itemProps3.xml><?xml version="1.0" encoding="utf-8"?>
+<ds:datastoreItem xmlns:ds="http://schemas.openxmlformats.org/officeDocument/2006/customXml" ds:itemID="{4E8DC2B8-F18C-4446-9EE4-D1204856FBD6}">
+  <ds:schemaRefs>
+    <ds:schemaRef ds:uri="http://purl.org/dc/terms/"/>
+    <ds:schemaRef ds:uri="http://schemas.microsoft.com/office/2006/documentManagement/types"/>
+    <ds:schemaRef ds:uri="http://schemas.openxmlformats.org/package/2006/metadata/core-properties"/>
+    <ds:schemaRef ds:uri="http://purl.org/dc/elements/1.1/"/>
+    <ds:schemaRef ds:uri="http://schemas.microsoft.com/office/2006/metadata/properties"/>
+    <ds:schemaRef ds:uri="edf48ee5-d2a0-4f04-99f4-0eb27cdb7c0d"/>
+    <ds:schemaRef ds:uri="http://schemas.microsoft.com/office/infopath/2007/PartnerControls"/>
+    <ds:schemaRef ds:uri="http://www.w3.org/XML/1998/namespace"/>
+    <ds:schemaRef ds:uri="http://purl.org/dc/dcmitype/"/>
+  </ds:schemaRefs>
+</ds:datastoreItem>
+</file>
+
 <file path=customXml/itemProps4.xml><?xml version="1.0" encoding="utf-8"?>
 <ds:datastoreItem xmlns:ds="http://schemas.openxmlformats.org/officeDocument/2006/customXml" ds:itemID="{E0CD3344-CEC1-47E2-87E4-477E77BC6903}">
   <ds:schemaRefs>
@@ -8250,7 +8339,7 @@
 </file>
 
 <file path=customXml/itemProps5.xml><?xml version="1.0" encoding="utf-8"?>
-<ds:datastoreItem xmlns:ds="http://schemas.openxmlformats.org/officeDocument/2006/customXml" ds:itemID="{4D69E287-402A-4A34-A6F1-DC53360BDCBF}">
+<ds:datastoreItem xmlns:ds="http://schemas.openxmlformats.org/officeDocument/2006/customXml" ds:itemID="{4447DF52-8F46-4738-9D51-8B4E634FDF4F}">
   <ds:schemaRefs>
     <ds:schemaRef ds:uri="http://schemas.openxmlformats.org/officeDocument/2006/bibliography"/>
   </ds:schemaRefs>

</xml_diff>